<commit_message>
feat: v1 | 29.4.2026 - Visual Keyboard UI
- Documentation add about Implementations
- Create title in top
- Change position footer from inside container to out of container
- Change html, css and js file
</commit_message>
<xml_diff>
--- a/3_visual-keyboard-ui/Project-3-visual keyboard ui.docx
+++ b/3_visual-keyboard-ui/Project-3-visual keyboard ui.docx
@@ -3,6 +3,9 @@
 <w:document xmlns:wpc="http://schemas.microsoft.com/office/word/2010/wordprocessingCanvas" xmlns:cx="http://schemas.microsoft.com/office/drawing/2014/chartex" xmlns:cx1="http://schemas.microsoft.com/office/drawing/2015/9/8/chartex" xmlns:cx2="http://schemas.microsoft.com/office/drawing/2015/10/21/chartex" xmlns:cx3="http://schemas.microsoft.com/office/drawing/2016/5/9/chartex" xmlns:cx4="http://schemas.microsoft.com/office/drawing/2016/5/10/chartex" xmlns:cx5="http://schemas.microsoft.com/office/drawing/2016/5/11/chartex" xmlns:cx6="http://schemas.microsoft.com/office/drawing/2016/5/12/chartex" xmlns:cx7="http://schemas.microsoft.com/office/drawing/2016/5/13/chartex" xmlns:cx8="http://schemas.microsoft.com/office/drawing/2016/5/14/chartex" xmlns:mc="http://schemas.openxmlformats.org/markup-compatibility/2006" xmlns:aink="http://schemas.microsoft.com/office/drawing/2016/ink" xmlns:am3d="http://schemas.microsoft.com/office/drawing/2017/model3d" xmlns:o="urn:schemas-microsoft-com:office:office" xmlns:oel="http://schemas.microsoft.com/office/2019/extlst" xmlns:r="http://schemas.openxmlformats.org/officeDocument/2006/relationships" xmlns:m="http://schemas.openxmlformats.org/officeDocument/2006/math" xmlns:v="urn:schemas-microsoft-com:vml" xmlns:wp14="http://schemas.microsoft.com/office/word/2010/wordprocessingDrawing" xmlns:wp="http://schemas.openxmlformats.org/drawingml/2006/wordprocessingDrawing" xmlns:w10="urn:schemas-microsoft-com:office:word" xmlns:w="http://schemas.openxmlformats.org/wordprocessingml/2006/main" xmlns:w14="http://schemas.microsoft.com/office/word/2010/wordml" xmlns:w15="http://schemas.microsoft.com/office/word/2012/wordml" xmlns:w16cex="http://schemas.microsoft.com/office/word/2018/wordml/cex" xmlns:w16cid="http://schemas.microsoft.com/office/word/2016/wordml/cid" xmlns:w16="http://schemas.microsoft.com/office/word/2018/wordml" xmlns:w16sdtdh="http://schemas.microsoft.com/office/word/2020/wordml/sdtdatahash" xmlns:w16se="http://schemas.microsoft.com/office/word/2015/wordml/symex" xmlns:wpg="http://schemas.microsoft.com/office/word/2010/wordprocessingGroup" xmlns:wpi="http://schemas.microsoft.com/office/word/2010/wordprocessingInk" xmlns:wne="http://schemas.microsoft.com/office/word/2006/wordml" xmlns:wps="http://schemas.microsoft.com/office/word/2010/wordprocessingShape" mc:Ignorable="w14 w15 w16se w16cid w16 w16cex w16sdtdh wp14">
   <w:body>
     <w:p>
+      <w:pPr>
+        <w:spacing w:line="240" w:lineRule="auto"/>
+      </w:pPr>
       <w:r>
         <w:t xml:space="preserve">Project - </w:t>
       </w:r>
@@ -12,6 +15,7 @@
     </w:p>
     <w:p>
       <w:pPr>
+        <w:spacing w:line="240" w:lineRule="auto"/>
         <w:rPr>
           <w:sz w:val="40"/>
           <w:szCs w:val="40"/>
@@ -26,12 +30,18 @@
       </w:r>
     </w:p>
     <w:p>
+      <w:pPr>
+        <w:spacing w:line="240" w:lineRule="auto"/>
+      </w:pPr>
       <w:r>
         <w:t>Web Based | No-Framework</w:t>
       </w:r>
     </w:p>
     <w:p>
-      <w:hyperlink r:id="rId4" w:history="1">
+      <w:pPr>
+        <w:spacing w:line="240" w:lineRule="auto"/>
+      </w:pPr>
+      <w:hyperlink r:id="rId5" w:history="1">
         <w:r>
           <w:rPr>
             <w:rStyle w:val="Hyperlink"/>
@@ -43,16 +53,42 @@
         <w:t xml:space="preserve"> </w:t>
       </w:r>
     </w:p>
-    <w:p/>
-    <w:p/>
-    <w:p>
+    <w:p>
+      <w:pPr>
+        <w:spacing w:line="240" w:lineRule="auto"/>
+      </w:pPr>
+    </w:p>
+    <w:p>
+      <w:pPr>
+        <w:spacing w:line="240" w:lineRule="auto"/>
+      </w:pPr>
+    </w:p>
+    <w:p>
+      <w:pPr>
+        <w:spacing w:line="240" w:lineRule="auto"/>
+      </w:pPr>
       <w:r>
         <w:t># Introduce</w:t>
       </w:r>
     </w:p>
     <w:p>
-      <w:r>
-        <w:t>So in this project I am create a Web Based App is Visual Keyboard UI (User Interface), this project is for anyone who want to check thei keyboard button is work or not</w:t>
+      <w:pPr>
+        <w:spacing w:line="240" w:lineRule="auto"/>
+      </w:pPr>
+      <w:r>
+        <w:t>So in this project I am create a Web Based App is Visual Keyboard UI (User Interface), this project is for anyone who want to check thei</w:t>
+      </w:r>
+      <w:r>
+        <w:t>r</w:t>
+      </w:r>
+      <w:r>
+        <w:t xml:space="preserve"> keyboard button is work</w:t>
+      </w:r>
+      <w:r>
+        <w:t xml:space="preserve">ing </w:t>
+      </w:r>
+      <w:r>
+        <w:t>or not</w:t>
       </w:r>
       <w:r>
         <w:t>, for example my “A” button keyboard is not working, so I know which button is not working</w:t>
@@ -61,8 +97,189 @@
         <w:t>.</w:t>
       </w:r>
     </w:p>
-    <w:p/>
-    <w:p>
+    <w:p>
+      <w:pPr>
+        <w:spacing w:line="240" w:lineRule="auto"/>
+      </w:pPr>
+    </w:p>
+    <w:p>
+      <w:pPr>
+        <w:spacing w:line="240" w:lineRule="auto"/>
+      </w:pPr>
+      <w:r>
+        <w:t># Tech Stack</w:t>
+      </w:r>
+    </w:p>
+    <w:tbl>
+      <w:tblPr>
+        <w:tblStyle w:val="TableGrid"/>
+        <w:tblW w:w="0" w:type="auto"/>
+        <w:tblLook w:val="04A0" w:firstRow="1" w:lastRow="0" w:firstColumn="1" w:lastColumn="0" w:noHBand="0" w:noVBand="1"/>
+      </w:tblPr>
+      <w:tblGrid>
+        <w:gridCol w:w="3256"/>
+        <w:gridCol w:w="6094"/>
+      </w:tblGrid>
+      <w:tr>
+        <w:tc>
+          <w:tcPr>
+            <w:tcW w:w="3256" w:type="dxa"/>
+          </w:tcPr>
+          <w:p>
+            <w:pPr>
+              <w:jc w:val="center"/>
+            </w:pPr>
+            <w:r>
+              <w:t>Field</w:t>
+            </w:r>
+          </w:p>
+        </w:tc>
+        <w:tc>
+          <w:tcPr>
+            <w:tcW w:w="6094" w:type="dxa"/>
+          </w:tcPr>
+          <w:p>
+            <w:pPr>
+              <w:jc w:val="center"/>
+            </w:pPr>
+            <w:r>
+              <w:t>Tech Stack</w:t>
+            </w:r>
+          </w:p>
+        </w:tc>
+      </w:tr>
+      <w:tr>
+        <w:tc>
+          <w:tcPr>
+            <w:tcW w:w="3256" w:type="dxa"/>
+          </w:tcPr>
+          <w:p>
+            <w:r>
+              <w:t>Front-End</w:t>
+            </w:r>
+          </w:p>
+        </w:tc>
+        <w:tc>
+          <w:tcPr>
+            <w:tcW w:w="6094" w:type="dxa"/>
+          </w:tcPr>
+          <w:p>
+            <w:pPr>
+              <w:pStyle w:val="ListParagraph"/>
+              <w:numPr>
+                <w:ilvl w:val="0"/>
+                <w:numId w:val="1"/>
+              </w:numPr>
+            </w:pPr>
+            <w:r>
+              <w:t>HTML</w:t>
+            </w:r>
+          </w:p>
+          <w:p>
+            <w:pPr>
+              <w:pStyle w:val="ListParagraph"/>
+              <w:numPr>
+                <w:ilvl w:val="0"/>
+                <w:numId w:val="1"/>
+              </w:numPr>
+            </w:pPr>
+            <w:r>
+              <w:t>CSS</w:t>
+            </w:r>
+          </w:p>
+          <w:p>
+            <w:pPr>
+              <w:pStyle w:val="ListParagraph"/>
+              <w:numPr>
+                <w:ilvl w:val="0"/>
+                <w:numId w:val="1"/>
+              </w:numPr>
+            </w:pPr>
+            <w:r>
+              <w:t>JS</w:t>
+            </w:r>
+          </w:p>
+        </w:tc>
+      </w:tr>
+      <w:tr>
+        <w:tc>
+          <w:tcPr>
+            <w:tcW w:w="3256" w:type="dxa"/>
+          </w:tcPr>
+          <w:p>
+            <w:r>
+              <w:t>Back-End</w:t>
+            </w:r>
+          </w:p>
+        </w:tc>
+        <w:tc>
+          <w:tcPr>
+            <w:tcW w:w="6094" w:type="dxa"/>
+          </w:tcPr>
+          <w:p>
+            <w:r>
+              <w:t>-</w:t>
+            </w:r>
+          </w:p>
+        </w:tc>
+      </w:tr>
+      <w:tr>
+        <w:tc>
+          <w:tcPr>
+            <w:tcW w:w="3256" w:type="dxa"/>
+          </w:tcPr>
+          <w:p>
+            <w:r>
+              <w:t>Database</w:t>
+            </w:r>
+          </w:p>
+        </w:tc>
+        <w:tc>
+          <w:tcPr>
+            <w:tcW w:w="6094" w:type="dxa"/>
+          </w:tcPr>
+          <w:p>
+            <w:r>
+              <w:t>-</w:t>
+            </w:r>
+          </w:p>
+        </w:tc>
+      </w:tr>
+      <w:tr>
+        <w:tc>
+          <w:tcPr>
+            <w:tcW w:w="3256" w:type="dxa"/>
+          </w:tcPr>
+          <w:p>
+            <w:r>
+              <w:t>S</w:t>
+            </w:r>
+            <w:r>
+              <w:t>erver</w:t>
+            </w:r>
+          </w:p>
+        </w:tc>
+        <w:tc>
+          <w:tcPr>
+            <w:tcW w:w="6094" w:type="dxa"/>
+          </w:tcPr>
+          <w:p>
+            <w:r>
+              <w:t>-</w:t>
+            </w:r>
+          </w:p>
+        </w:tc>
+      </w:tr>
+    </w:tbl>
+    <w:p>
+      <w:pPr>
+        <w:spacing w:line="240" w:lineRule="auto"/>
+      </w:pPr>
+    </w:p>
+    <w:p>
+      <w:pPr>
+        <w:spacing w:line="240" w:lineRule="auto"/>
+      </w:pPr>
       <w:r>
         <w:t xml:space="preserve"># </w:t>
       </w:r>
@@ -79,23 +296,818 @@
         <w:t>Standard/Waterfall</w:t>
       </w:r>
     </w:p>
-    <w:p/>
-    <w:p/>
-    <w:p/>
-    <w:p>
+    <w:p>
+      <w:pPr>
+        <w:spacing w:line="240" w:lineRule="auto"/>
+      </w:pPr>
+    </w:p>
+    <w:p>
+      <w:pPr>
+        <w:spacing w:line="240" w:lineRule="auto"/>
+      </w:pPr>
+    </w:p>
+    <w:p>
+      <w:pPr>
+        <w:spacing w:line="240" w:lineRule="auto"/>
+      </w:pPr>
+    </w:p>
+    <w:p>
+      <w:pPr>
+        <w:spacing w:line="240" w:lineRule="auto"/>
+      </w:pPr>
+      <w:r>
+        <w:t># Project Structure</w:t>
+      </w:r>
+    </w:p>
+    <w:p>
+      <w:pPr>
+        <w:pStyle w:val="NoSpacing"/>
+      </w:pPr>
+      <w:r>
+        <w:t>3_visual-keyboard-ui/</w:t>
+      </w:r>
+    </w:p>
+    <w:p>
+      <w:pPr>
+        <w:pStyle w:val="NoSpacing"/>
+      </w:pPr>
+      <w:r>
+        <w:t>vscode/</w:t>
+      </w:r>
+    </w:p>
+    <w:p>
+      <w:pPr>
+        <w:pStyle w:val="NoSpacing"/>
+      </w:pPr>
+      <w:r>
+        <w:t>-- index.html</w:t>
+      </w:r>
+    </w:p>
+    <w:p>
+      <w:pPr>
+        <w:pStyle w:val="NoSpacing"/>
+      </w:pPr>
+      <w:r>
+        <w:t>-- main.js</w:t>
+      </w:r>
+    </w:p>
+    <w:p>
+      <w:pPr>
+        <w:pStyle w:val="NoSpacing"/>
+      </w:pPr>
+      <w:r>
+        <w:t>-- style.css</w:t>
+      </w:r>
+    </w:p>
+    <w:p>
+      <w:pPr>
+        <w:pStyle w:val="NoSpacing"/>
+      </w:pPr>
+      <w:r>
+        <w:t>Project-3-diagram.drawio</w:t>
+      </w:r>
+    </w:p>
+    <w:p>
+      <w:pPr>
+        <w:pStyle w:val="NoSpacing"/>
+      </w:pPr>
+      <w:r>
+        <w:t>Project-3-visual keyboard ui.docx</w:t>
+      </w:r>
+    </w:p>
+    <w:p>
+      <w:pPr>
+        <w:spacing w:line="240" w:lineRule="auto"/>
+      </w:pPr>
+    </w:p>
+    <w:p>
+      <w:pPr>
+        <w:spacing w:line="240" w:lineRule="auto"/>
+      </w:pPr>
+    </w:p>
+    <w:p>
+      <w:pPr>
+        <w:spacing w:line="240" w:lineRule="auto"/>
+      </w:pPr>
+    </w:p>
+    <w:p>
+      <w:pPr>
+        <w:spacing w:line="240" w:lineRule="auto"/>
+      </w:pPr>
+    </w:p>
+    <w:p>
+      <w:pPr>
+        <w:spacing w:line="240" w:lineRule="auto"/>
+      </w:pPr>
+    </w:p>
+    <w:p>
+      <w:pPr>
+        <w:spacing w:line="240" w:lineRule="auto"/>
+      </w:pPr>
+    </w:p>
+    <w:p>
+      <w:pPr>
+        <w:spacing w:line="240" w:lineRule="auto"/>
+      </w:pPr>
+    </w:p>
+    <w:p>
+      <w:pPr>
+        <w:spacing w:line="240" w:lineRule="auto"/>
+      </w:pPr>
+    </w:p>
+    <w:p>
+      <w:pPr>
+        <w:spacing w:line="240" w:lineRule="auto"/>
+      </w:pPr>
+      <w:r>
+        <w:lastRenderedPageBreak/>
+        <w:t># Implementations</w:t>
+      </w:r>
+    </w:p>
+    <w:p>
+      <w:pPr>
+        <w:spacing w:line="240" w:lineRule="auto"/>
+      </w:pPr>
+      <w:r>
+        <w:t>For implementations we must understand</w:t>
+      </w:r>
+    </w:p>
+    <w:p>
+      <w:pPr>
+        <w:pStyle w:val="ListParagraph"/>
+        <w:numPr>
+          <w:ilvl w:val="0"/>
+          <w:numId w:val="1"/>
+        </w:numPr>
+        <w:spacing w:line="240" w:lineRule="auto"/>
+      </w:pPr>
+      <w:r>
+        <w:t>Keyboard layout</w:t>
+      </w:r>
+    </w:p>
+    <w:p>
+      <w:pPr>
+        <w:pStyle w:val="ListParagraph"/>
+        <w:numPr>
+          <w:ilvl w:val="0"/>
+          <w:numId w:val="1"/>
+        </w:numPr>
+        <w:spacing w:line="240" w:lineRule="auto"/>
+      </w:pPr>
+      <w:r>
+        <w:t>DOM Javscript</w:t>
+      </w:r>
+    </w:p>
+    <w:p>
+      <w:pPr>
+        <w:pStyle w:val="ListParagraph"/>
+        <w:numPr>
+          <w:ilvl w:val="0"/>
+          <w:numId w:val="1"/>
+        </w:numPr>
+        <w:spacing w:line="240" w:lineRule="auto"/>
+      </w:pPr>
+      <w:r>
+        <w:t>HTML Layout</w:t>
+      </w:r>
+    </w:p>
+    <w:p>
+      <w:pPr>
+        <w:pStyle w:val="ListParagraph"/>
+        <w:numPr>
+          <w:ilvl w:val="0"/>
+          <w:numId w:val="1"/>
+        </w:numPr>
+        <w:spacing w:line="240" w:lineRule="auto"/>
+      </w:pPr>
+      <w:r>
+        <w:t>CSS styling for more colorful and good</w:t>
+      </w:r>
+    </w:p>
+    <w:p>
+      <w:pPr>
+        <w:spacing w:line="240" w:lineRule="auto"/>
+      </w:pPr>
+    </w:p>
+    <w:p>
+      <w:pPr>
+        <w:spacing w:line="240" w:lineRule="auto"/>
+      </w:pPr>
+    </w:p>
+    <w:p>
+      <w:pPr>
+        <w:spacing w:line="240" w:lineRule="auto"/>
+      </w:pPr>
+      <w:r>
+        <w:t>For how keyboard work</w:t>
+      </w:r>
+    </w:p>
+    <w:p>
+      <w:pPr>
+        <w:spacing w:line="240" w:lineRule="auto"/>
+        <w:jc w:val="center"/>
+      </w:pPr>
+      <w:r>
+        <w:rPr>
+          <w:noProof/>
+        </w:rPr>
+        <w:drawing>
+          <wp:inline distT="0" distB="0" distL="0" distR="0" wp14:anchorId="62443D75" wp14:editId="76F81B44">
+            <wp:extent cx="5943600" cy="2079625"/>
+            <wp:effectExtent l="0" t="0" r="0" b="0"/>
+            <wp:docPr id="1350873581" name="Picture 4"/>
+            <wp:cNvGraphicFramePr>
+              <a:graphicFrameLocks xmlns:a="http://schemas.openxmlformats.org/drawingml/2006/main" noChangeAspect="1"/>
+            </wp:cNvGraphicFramePr>
+            <a:graphic xmlns:a="http://schemas.openxmlformats.org/drawingml/2006/main">
+              <a:graphicData uri="http://schemas.openxmlformats.org/drawingml/2006/picture">
+                <pic:pic xmlns:pic="http://schemas.openxmlformats.org/drawingml/2006/picture">
+                  <pic:nvPicPr>
+                    <pic:cNvPr id="0" name="Picture 7"/>
+                    <pic:cNvPicPr>
+                      <a:picLocks noChangeAspect="1" noChangeArrowheads="1"/>
+                    </pic:cNvPicPr>
+                  </pic:nvPicPr>
+                  <pic:blipFill>
+                    <a:blip r:embed="rId6">
+                      <a:extLst>
+                        <a:ext uri="{28A0092B-C50C-407E-A947-70E740481C1C}">
+                          <a14:useLocalDpi xmlns:a14="http://schemas.microsoft.com/office/drawing/2010/main" val="0"/>
+                        </a:ext>
+                      </a:extLst>
+                    </a:blip>
+                    <a:srcRect/>
+                    <a:stretch>
+                      <a:fillRect/>
+                    </a:stretch>
+                  </pic:blipFill>
+                  <pic:spPr bwMode="auto">
+                    <a:xfrm>
+                      <a:off x="0" y="0"/>
+                      <a:ext cx="5943600" cy="2079625"/>
+                    </a:xfrm>
+                    <a:prstGeom prst="rect">
+                      <a:avLst/>
+                    </a:prstGeom>
+                    <a:noFill/>
+                    <a:ln>
+                      <a:noFill/>
+                    </a:ln>
+                  </pic:spPr>
+                </pic:pic>
+              </a:graphicData>
+            </a:graphic>
+          </wp:inline>
+        </w:drawing>
+      </w:r>
+    </w:p>
+    <w:p>
+      <w:pPr>
+        <w:spacing w:line="240" w:lineRule="auto"/>
+        <w:jc w:val="center"/>
+      </w:pPr>
+      <w:r>
+        <w:t xml:space="preserve">Image. </w:t>
+      </w:r>
+      <w:r>
+        <w:t>Keyboard layout</w:t>
+      </w:r>
+      <w:r>
+        <w:t xml:space="preserve"> standard </w:t>
+      </w:r>
+      <w:r>
+        <w:t>full 100%</w:t>
+      </w:r>
+    </w:p>
+    <w:p>
+      <w:pPr>
+        <w:spacing w:line="240" w:lineRule="auto"/>
+      </w:pPr>
+      <w:r>
+        <w:t>In keyboard have</w:t>
+      </w:r>
+      <w:r>
+        <w:t>.</w:t>
+      </w:r>
+    </w:p>
+    <w:p>
+      <w:pPr>
+        <w:pStyle w:val="ListParagraph"/>
+        <w:numPr>
+          <w:ilvl w:val="0"/>
+          <w:numId w:val="1"/>
+        </w:numPr>
+        <w:spacing w:line="240" w:lineRule="auto"/>
+      </w:pPr>
+      <w:r>
+        <w:t>Letter low and high</w:t>
+      </w:r>
+    </w:p>
+    <w:p>
+      <w:pPr>
+        <w:pStyle w:val="ListParagraph"/>
+        <w:numPr>
+          <w:ilvl w:val="0"/>
+          <w:numId w:val="1"/>
+        </w:numPr>
+        <w:spacing w:line="240" w:lineRule="auto"/>
+      </w:pPr>
+      <w:r>
+        <w:t>Symbol</w:t>
+      </w:r>
+    </w:p>
+    <w:p>
+      <w:pPr>
+        <w:pStyle w:val="ListParagraph"/>
+        <w:numPr>
+          <w:ilvl w:val="0"/>
+          <w:numId w:val="1"/>
+        </w:numPr>
+        <w:spacing w:line="240" w:lineRule="auto"/>
+      </w:pPr>
+      <w:r>
+        <w:t>Special button (ALT, CTRL, ect)</w:t>
+      </w:r>
+    </w:p>
+    <w:p>
+      <w:pPr>
+        <w:spacing w:line="240" w:lineRule="auto"/>
+      </w:pPr>
+      <w:r>
+        <w:t>So we need to group by line</w:t>
+      </w:r>
+      <w:r>
+        <w:t>.</w:t>
+      </w:r>
+    </w:p>
+    <w:tbl>
+      <w:tblPr>
+        <w:tblStyle w:val="TableGrid"/>
+        <w:tblW w:w="0" w:type="auto"/>
+        <w:tblLook w:val="04A0" w:firstRow="1" w:lastRow="0" w:firstColumn="1" w:lastColumn="0" w:noHBand="0" w:noVBand="1"/>
+      </w:tblPr>
+      <w:tblGrid>
+        <w:gridCol w:w="1129"/>
+        <w:gridCol w:w="8221"/>
+      </w:tblGrid>
+      <w:tr>
+        <w:tc>
+          <w:tcPr>
+            <w:tcW w:w="1129" w:type="dxa"/>
+          </w:tcPr>
+          <w:p>
+            <w:pPr>
+              <w:jc w:val="center"/>
+            </w:pPr>
+            <w:r>
+              <w:t>Line</w:t>
+            </w:r>
+          </w:p>
+        </w:tc>
+        <w:tc>
+          <w:tcPr>
+            <w:tcW w:w="8221" w:type="dxa"/>
+          </w:tcPr>
+          <w:p>
+            <w:pPr>
+              <w:jc w:val="center"/>
+            </w:pPr>
+            <w:r>
+              <w:t>Detail</w:t>
+            </w:r>
+          </w:p>
+        </w:tc>
+      </w:tr>
+      <w:tr>
+        <w:tc>
+          <w:tcPr>
+            <w:tcW w:w="1129" w:type="dxa"/>
+          </w:tcPr>
+          <w:p>
+            <w:r>
+              <w:t>Line 1</w:t>
+            </w:r>
+          </w:p>
+        </w:tc>
+        <w:tc>
+          <w:tcPr>
+            <w:tcW w:w="8221" w:type="dxa"/>
+          </w:tcPr>
+          <w:p>
+            <w:r>
+              <w:t>ESC, F1 … F12,</w:t>
+            </w:r>
+            <w:r>
+              <w:t xml:space="preserve"> </w:t>
+            </w:r>
+            <w:r>
+              <w:t>DEL</w:t>
+            </w:r>
+          </w:p>
+        </w:tc>
+      </w:tr>
+      <w:tr>
+        <w:tc>
+          <w:tcPr>
+            <w:tcW w:w="1129" w:type="dxa"/>
+          </w:tcPr>
+          <w:p>
+            <w:r>
+              <w:t>Line 2</w:t>
+            </w:r>
+          </w:p>
+        </w:tc>
+        <w:tc>
+          <w:tcPr>
+            <w:tcW w:w="8221" w:type="dxa"/>
+          </w:tcPr>
+          <w:p>
+            <w:r>
+              <w:t xml:space="preserve">`, ~, 1 … 0, -, _, +, =, </w:t>
+            </w:r>
+            <w:r>
+              <w:t>BACKSPACE</w:t>
+            </w:r>
+            <w:r>
+              <w:t xml:space="preserve">, </w:t>
+            </w:r>
+            <w:r>
+              <w:t>!, @, #, $, %, ^, &amp;, *, (, )</w:t>
+            </w:r>
+          </w:p>
+        </w:tc>
+      </w:tr>
+      <w:tr>
+        <w:tc>
+          <w:tcPr>
+            <w:tcW w:w="1129" w:type="dxa"/>
+          </w:tcPr>
+          <w:p>
+            <w:r>
+              <w:t>Line 3</w:t>
+            </w:r>
+          </w:p>
+        </w:tc>
+        <w:tc>
+          <w:tcPr>
+            <w:tcW w:w="8221" w:type="dxa"/>
+          </w:tcPr>
+          <w:p>
+            <w:r>
+              <w:t xml:space="preserve">TAB, QWERTYUIOP, {, }, [, ], \, |, INSERT, </w:t>
+            </w:r>
+          </w:p>
+        </w:tc>
+      </w:tr>
+      <w:tr>
+        <w:tc>
+          <w:tcPr>
+            <w:tcW w:w="1129" w:type="dxa"/>
+          </w:tcPr>
+          <w:p>
+            <w:r>
+              <w:t>Line 4</w:t>
+            </w:r>
+          </w:p>
+        </w:tc>
+        <w:tc>
+          <w:tcPr>
+            <w:tcW w:w="8221" w:type="dxa"/>
+          </w:tcPr>
+          <w:p/>
+        </w:tc>
+      </w:tr>
+      <w:tr>
+        <w:tc>
+          <w:tcPr>
+            <w:tcW w:w="1129" w:type="dxa"/>
+          </w:tcPr>
+          <w:p>
+            <w:r>
+              <w:t>Line 5</w:t>
+            </w:r>
+          </w:p>
+        </w:tc>
+        <w:tc>
+          <w:tcPr>
+            <w:tcW w:w="8221" w:type="dxa"/>
+          </w:tcPr>
+          <w:p/>
+        </w:tc>
+      </w:tr>
+      <w:tr>
+        <w:tc>
+          <w:tcPr>
+            <w:tcW w:w="1129" w:type="dxa"/>
+          </w:tcPr>
+          <w:p>
+            <w:r>
+              <w:t>Line 6</w:t>
+            </w:r>
+          </w:p>
+        </w:tc>
+        <w:tc>
+          <w:tcPr>
+            <w:tcW w:w="8221" w:type="dxa"/>
+          </w:tcPr>
+          <w:p>
+            <w:r>
+              <w:t xml:space="preserve">CTRL, HOME, ALT, SPACEBAR, </w:t>
+            </w:r>
+            <w:r>
+              <w:t>FN, ARROW_LEFT, ARROW_DOWN, ARROW_RIGHT</w:t>
+            </w:r>
+            <w:r>
+              <w:t xml:space="preserve">, </w:t>
+            </w:r>
+            <w:r>
+              <w:t>0, ., ENTER</w:t>
+            </w:r>
+          </w:p>
+        </w:tc>
+      </w:tr>
+    </w:tbl>
+    <w:p>
+      <w:pPr>
+        <w:spacing w:line="240" w:lineRule="auto"/>
+      </w:pPr>
+    </w:p>
+    <w:p>
+      <w:pPr>
+        <w:spacing w:line="240" w:lineRule="auto"/>
+      </w:pPr>
+    </w:p>
+    <w:p>
+      <w:pPr>
+        <w:spacing w:line="240" w:lineRule="auto"/>
+      </w:pPr>
+    </w:p>
+    <w:p>
+      <w:pPr>
+        <w:spacing w:line="240" w:lineRule="auto"/>
+      </w:pPr>
+    </w:p>
+    <w:p>
+      <w:pPr>
+        <w:spacing w:line="240" w:lineRule="auto"/>
+      </w:pPr>
+    </w:p>
+    <w:p>
+      <w:pPr>
+        <w:spacing w:line="240" w:lineRule="auto"/>
+      </w:pPr>
+    </w:p>
+    <w:p>
+      <w:pPr>
+        <w:spacing w:line="240" w:lineRule="auto"/>
+      </w:pPr>
+    </w:p>
+    <w:p>
+      <w:pPr>
+        <w:spacing w:line="240" w:lineRule="auto"/>
+      </w:pPr>
+    </w:p>
+    <w:p>
+      <w:pPr>
+        <w:spacing w:line="240" w:lineRule="auto"/>
+      </w:pPr>
       <w:r>
         <w:t># Versions</w:t>
       </w:r>
     </w:p>
-    <w:p/>
-    <w:p/>
-    <w:p/>
-    <w:p/>
-    <w:p/>
-    <w:p/>
-    <w:p/>
-    <w:p/>
-    <w:p/>
+    <w:p>
+      <w:pPr>
+        <w:pStyle w:val="NoSpacing"/>
+        <w:rPr>
+          <w:b/>
+          <w:bCs/>
+        </w:rPr>
+      </w:pPr>
+      <w:r>
+        <w:rPr>
+          <w:b/>
+          <w:bCs/>
+        </w:rPr>
+        <w:lastRenderedPageBreak/>
+        <w:t>v1 | Code release: 29.4.2026</w:t>
+      </w:r>
+    </w:p>
+    <w:p>
+      <w:pPr>
+        <w:pStyle w:val="NoSpacing"/>
+      </w:pPr>
+      <w:r>
+        <w:t>commit cd7b7f12ac0d356198789dceda11ad128677c962 (HEAD -&gt; master, origin/master)</w:t>
+      </w:r>
+    </w:p>
+    <w:p>
+      <w:pPr>
+        <w:pStyle w:val="NoSpacing"/>
+      </w:pPr>
+      <w:r>
+        <w:t>Author: ifandika &lt;ifandika014@gmail.com&gt;</w:t>
+      </w:r>
+    </w:p>
+    <w:p>
+      <w:pPr>
+        <w:pStyle w:val="NoSpacing"/>
+      </w:pPr>
+      <w:r>
+        <w:t>Date:   Wed Apr 29 11:07:37 2026 +0700</w:t>
+      </w:r>
+    </w:p>
+    <w:p>
+      <w:pPr>
+        <w:pStyle w:val="NoSpacing"/>
+      </w:pPr>
+    </w:p>
+    <w:p>
+      <w:pPr>
+        <w:pStyle w:val="NoSpacing"/>
+      </w:pPr>
+      <w:r>
+        <w:t xml:space="preserve">    feat: v1 | 29.4.2026 - Visual Keyboard UI</w:t>
+      </w:r>
+    </w:p>
+    <w:p>
+      <w:pPr>
+        <w:pStyle w:val="NoSpacing"/>
+      </w:pPr>
+    </w:p>
+    <w:p>
+      <w:pPr>
+        <w:pStyle w:val="NoSpacing"/>
+      </w:pPr>
+      <w:r>
+        <w:t xml:space="preserve">    - Create html layout for standard keyboard button (index.html)</w:t>
+      </w:r>
+    </w:p>
+    <w:p>
+      <w:pPr>
+        <w:pStyle w:val="NoSpacing"/>
+      </w:pPr>
+      <w:r>
+        <w:t xml:space="preserve">    - Styling layout using CSS external file (style.css)</w:t>
+      </w:r>
+    </w:p>
+    <w:p>
+      <w:pPr>
+        <w:pStyle w:val="NoSpacing"/>
+      </w:pPr>
+      <w:r>
+        <w:t xml:space="preserve">    - Making interactive and more looking good using Javascript external file (main.js)</w:t>
+      </w:r>
+    </w:p>
+    <w:p>
+      <w:pPr>
+        <w:pStyle w:val="NoSpacing"/>
+      </w:pPr>
+      <w:r>
+        <w:t xml:space="preserve">    - Create file diagram for flow app using draw.io</w:t>
+      </w:r>
+    </w:p>
+    <w:p>
+      <w:pPr>
+        <w:pStyle w:val="NoSpacing"/>
+      </w:pPr>
+      <w:r>
+        <w:t xml:space="preserve">    - Create word file for documentation and report</w:t>
+      </w:r>
+    </w:p>
+    <w:p>
+      <w:pPr>
+        <w:spacing w:line="240" w:lineRule="auto"/>
+      </w:pPr>
+    </w:p>
+    <w:p>
+      <w:pPr>
+        <w:spacing w:line="240" w:lineRule="auto"/>
+      </w:pPr>
+    </w:p>
+    <w:p>
+      <w:pPr>
+        <w:tabs>
+          <w:tab w:val="left" w:pos="2426"/>
+        </w:tabs>
+        <w:spacing w:line="240" w:lineRule="auto"/>
+      </w:pPr>
+      <w:r>
+        <w:tab/>
+      </w:r>
+    </w:p>
+    <w:p>
+      <w:pPr>
+        <w:tabs>
+          <w:tab w:val="left" w:pos="2426"/>
+        </w:tabs>
+        <w:spacing w:line="240" w:lineRule="auto"/>
+      </w:pPr>
+    </w:p>
+    <w:p>
+      <w:pPr>
+        <w:tabs>
+          <w:tab w:val="left" w:pos="2426"/>
+        </w:tabs>
+        <w:spacing w:line="240" w:lineRule="auto"/>
+      </w:pPr>
+    </w:p>
+    <w:p>
+      <w:pPr>
+        <w:tabs>
+          <w:tab w:val="left" w:pos="2426"/>
+        </w:tabs>
+        <w:spacing w:line="240" w:lineRule="auto"/>
+      </w:pPr>
+    </w:p>
+    <w:p>
+      <w:pPr>
+        <w:tabs>
+          <w:tab w:val="left" w:pos="2426"/>
+        </w:tabs>
+        <w:spacing w:line="240" w:lineRule="auto"/>
+      </w:pPr>
+    </w:p>
+    <w:p>
+      <w:pPr>
+        <w:tabs>
+          <w:tab w:val="left" w:pos="2426"/>
+        </w:tabs>
+        <w:spacing w:line="240" w:lineRule="auto"/>
+      </w:pPr>
+    </w:p>
+    <w:p>
+      <w:pPr>
+        <w:tabs>
+          <w:tab w:val="left" w:pos="2426"/>
+        </w:tabs>
+        <w:spacing w:line="240" w:lineRule="auto"/>
+      </w:pPr>
+    </w:p>
+    <w:p>
+      <w:pPr>
+        <w:tabs>
+          <w:tab w:val="left" w:pos="2426"/>
+        </w:tabs>
+        <w:spacing w:line="240" w:lineRule="auto"/>
+      </w:pPr>
+    </w:p>
+    <w:p>
+      <w:pPr>
+        <w:tabs>
+          <w:tab w:val="left" w:pos="2426"/>
+        </w:tabs>
+        <w:spacing w:line="240" w:lineRule="auto"/>
+      </w:pPr>
+    </w:p>
+    <w:p>
+      <w:pPr>
+        <w:tabs>
+          <w:tab w:val="left" w:pos="2426"/>
+        </w:tabs>
+        <w:spacing w:line="240" w:lineRule="auto"/>
+      </w:pPr>
+    </w:p>
+    <w:p>
+      <w:pPr>
+        <w:tabs>
+          <w:tab w:val="left" w:pos="2426"/>
+        </w:tabs>
+        <w:spacing w:line="240" w:lineRule="auto"/>
+      </w:pPr>
+    </w:p>
+    <w:p>
+      <w:pPr>
+        <w:tabs>
+          <w:tab w:val="left" w:pos="2426"/>
+        </w:tabs>
+        <w:spacing w:line="240" w:lineRule="auto"/>
+      </w:pPr>
+    </w:p>
+    <w:p>
+      <w:pPr>
+        <w:spacing w:line="240" w:lineRule="auto"/>
+      </w:pPr>
+    </w:p>
+    <w:p>
+      <w:pPr>
+        <w:spacing w:line="240" w:lineRule="auto"/>
+      </w:pPr>
+    </w:p>
+    <w:p>
+      <w:pPr>
+        <w:spacing w:line="240" w:lineRule="auto"/>
+      </w:pPr>
+    </w:p>
+    <w:p>
+      <w:pPr>
+        <w:spacing w:line="240" w:lineRule="auto"/>
+      </w:pPr>
+    </w:p>
+    <w:p>
+      <w:pPr>
+        <w:spacing w:line="240" w:lineRule="auto"/>
+      </w:pPr>
+    </w:p>
     <w:sectPr>
       <w:pgSz w:w="12240" w:h="18720" w:code="14"/>
       <w:pgMar w:top="1440" w:right="1440" w:bottom="1440" w:left="1440" w:header="720" w:footer="720" w:gutter="0"/>
@@ -104,6 +1116,126 @@
     </w:sectPr>
   </w:body>
 </w:document>
+</file>
+
+<file path=word/numbering.xml><?xml version="1.0" encoding="utf-8"?>
+<w:numbering xmlns:wpc="http://schemas.microsoft.com/office/word/2010/wordprocessingCanvas" xmlns:cx="http://schemas.microsoft.com/office/drawing/2014/chartex" xmlns:cx1="http://schemas.microsoft.com/office/drawing/2015/9/8/chartex" xmlns:cx2="http://schemas.microsoft.com/office/drawing/2015/10/21/chartex" xmlns:cx3="http://schemas.microsoft.com/office/drawing/2016/5/9/chartex" xmlns:cx4="http://schemas.microsoft.com/office/drawing/2016/5/10/chartex" xmlns:cx5="http://schemas.microsoft.com/office/drawing/2016/5/11/chartex" xmlns:cx6="http://schemas.microsoft.com/office/drawing/2016/5/12/chartex" xmlns:cx7="http://schemas.microsoft.com/office/drawing/2016/5/13/chartex" xmlns:cx8="http://schemas.microsoft.com/office/drawing/2016/5/14/chartex" xmlns:mc="http://schemas.openxmlformats.org/markup-compatibility/2006" xmlns:aink="http://schemas.microsoft.com/office/drawing/2016/ink" xmlns:am3d="http://schemas.microsoft.com/office/drawing/2017/model3d" xmlns:o="urn:schemas-microsoft-com:office:office" xmlns:oel="http://schemas.microsoft.com/office/2019/extlst" xmlns:r="http://schemas.openxmlformats.org/officeDocument/2006/relationships" xmlns:m="http://schemas.openxmlformats.org/officeDocument/2006/math" xmlns:v="urn:schemas-microsoft-com:vml" xmlns:wp14="http://schemas.microsoft.com/office/word/2010/wordprocessingDrawing" xmlns:wp="http://schemas.openxmlformats.org/drawingml/2006/wordprocessingDrawing" xmlns:w10="urn:schemas-microsoft-com:office:word" xmlns:w="http://schemas.openxmlformats.org/wordprocessingml/2006/main" xmlns:w14="http://schemas.microsoft.com/office/word/2010/wordml" xmlns:w15="http://schemas.microsoft.com/office/word/2012/wordml" xmlns:w16cex="http://schemas.microsoft.com/office/word/2018/wordml/cex" xmlns:w16cid="http://schemas.microsoft.com/office/word/2016/wordml/cid" xmlns:w16="http://schemas.microsoft.com/office/word/2018/wordml" xmlns:w16sdtdh="http://schemas.microsoft.com/office/word/2020/wordml/sdtdatahash" xmlns:w16se="http://schemas.microsoft.com/office/word/2015/wordml/symex" xmlns:wpg="http://schemas.microsoft.com/office/word/2010/wordprocessingGroup" xmlns:wpi="http://schemas.microsoft.com/office/word/2010/wordprocessingInk" xmlns:wne="http://schemas.microsoft.com/office/word/2006/wordml" xmlns:wps="http://schemas.microsoft.com/office/word/2010/wordprocessingShape" mc:Ignorable="w14 w15 w16se w16cid w16 w16cex w16sdtdh wp14">
+  <w:abstractNum w:abstractNumId="0" w15:restartNumberingAfterBreak="0">
+    <w:nsid w:val="78BD3B8B"/>
+    <w:multiLevelType w:val="hybridMultilevel"/>
+    <w:tmpl w:val="DA708DD6"/>
+    <w:lvl w:ilvl="0" w:tplc="467A2C46">
+      <w:numFmt w:val="bullet"/>
+      <w:lvlText w:val="-"/>
+      <w:lvlJc w:val="left"/>
+      <w:pPr>
+        <w:ind w:left="720" w:hanging="360"/>
+      </w:pPr>
+      <w:rPr>
+        <w:rFonts w:ascii="Aptos" w:eastAsiaTheme="minorHAnsi" w:hAnsi="Aptos" w:cstheme="minorBidi" w:hint="default"/>
+      </w:rPr>
+    </w:lvl>
+    <w:lvl w:ilvl="1" w:tplc="04090003" w:tentative="1">
+      <w:start w:val="1"/>
+      <w:numFmt w:val="bullet"/>
+      <w:lvlText w:val="o"/>
+      <w:lvlJc w:val="left"/>
+      <w:pPr>
+        <w:ind w:left="1440" w:hanging="360"/>
+      </w:pPr>
+      <w:rPr>
+        <w:rFonts w:ascii="Courier New" w:hAnsi="Courier New" w:cs="Courier New" w:hint="default"/>
+      </w:rPr>
+    </w:lvl>
+    <w:lvl w:ilvl="2" w:tplc="04090005" w:tentative="1">
+      <w:start w:val="1"/>
+      <w:numFmt w:val="bullet"/>
+      <w:lvlText w:val=""/>
+      <w:lvlJc w:val="left"/>
+      <w:pPr>
+        <w:ind w:left="2160" w:hanging="360"/>
+      </w:pPr>
+      <w:rPr>
+        <w:rFonts w:ascii="Wingdings" w:hAnsi="Wingdings" w:hint="default"/>
+      </w:rPr>
+    </w:lvl>
+    <w:lvl w:ilvl="3" w:tplc="04090001" w:tentative="1">
+      <w:start w:val="1"/>
+      <w:numFmt w:val="bullet"/>
+      <w:lvlText w:val=""/>
+      <w:lvlJc w:val="left"/>
+      <w:pPr>
+        <w:ind w:left="2880" w:hanging="360"/>
+      </w:pPr>
+      <w:rPr>
+        <w:rFonts w:ascii="Symbol" w:hAnsi="Symbol" w:hint="default"/>
+      </w:rPr>
+    </w:lvl>
+    <w:lvl w:ilvl="4" w:tplc="04090003" w:tentative="1">
+      <w:start w:val="1"/>
+      <w:numFmt w:val="bullet"/>
+      <w:lvlText w:val="o"/>
+      <w:lvlJc w:val="left"/>
+      <w:pPr>
+        <w:ind w:left="3600" w:hanging="360"/>
+      </w:pPr>
+      <w:rPr>
+        <w:rFonts w:ascii="Courier New" w:hAnsi="Courier New" w:cs="Courier New" w:hint="default"/>
+      </w:rPr>
+    </w:lvl>
+    <w:lvl w:ilvl="5" w:tplc="04090005" w:tentative="1">
+      <w:start w:val="1"/>
+      <w:numFmt w:val="bullet"/>
+      <w:lvlText w:val=""/>
+      <w:lvlJc w:val="left"/>
+      <w:pPr>
+        <w:ind w:left="4320" w:hanging="360"/>
+      </w:pPr>
+      <w:rPr>
+        <w:rFonts w:ascii="Wingdings" w:hAnsi="Wingdings" w:hint="default"/>
+      </w:rPr>
+    </w:lvl>
+    <w:lvl w:ilvl="6" w:tplc="04090001" w:tentative="1">
+      <w:start w:val="1"/>
+      <w:numFmt w:val="bullet"/>
+      <w:lvlText w:val=""/>
+      <w:lvlJc w:val="left"/>
+      <w:pPr>
+        <w:ind w:left="5040" w:hanging="360"/>
+      </w:pPr>
+      <w:rPr>
+        <w:rFonts w:ascii="Symbol" w:hAnsi="Symbol" w:hint="default"/>
+      </w:rPr>
+    </w:lvl>
+    <w:lvl w:ilvl="7" w:tplc="04090003" w:tentative="1">
+      <w:start w:val="1"/>
+      <w:numFmt w:val="bullet"/>
+      <w:lvlText w:val="o"/>
+      <w:lvlJc w:val="left"/>
+      <w:pPr>
+        <w:ind w:left="5760" w:hanging="360"/>
+      </w:pPr>
+      <w:rPr>
+        <w:rFonts w:ascii="Courier New" w:hAnsi="Courier New" w:cs="Courier New" w:hint="default"/>
+      </w:rPr>
+    </w:lvl>
+    <w:lvl w:ilvl="8" w:tplc="04090005" w:tentative="1">
+      <w:start w:val="1"/>
+      <w:numFmt w:val="bullet"/>
+      <w:lvlText w:val=""/>
+      <w:lvlJc w:val="left"/>
+      <w:pPr>
+        <w:ind w:left="6480" w:hanging="360"/>
+      </w:pPr>
+      <w:rPr>
+        <w:rFonts w:ascii="Wingdings" w:hAnsi="Wingdings" w:hint="default"/>
+      </w:rPr>
+    </w:lvl>
+  </w:abstractNum>
+  <w:num w:numId="1" w16cid:durableId="1540972424">
+    <w:abstractNumId w:val="0"/>
+  </w:num>
+</w:numbering>
 </file>
 
 <file path=word/styles.xml><?xml version="1.0" encoding="utf-8"?>
@@ -1046,6 +2178,34 @@
       <w:shd w:val="clear" w:color="auto" w:fill="E1DFDD"/>
     </w:rPr>
   </w:style>
+  <w:style w:type="paragraph" w:styleId="NoSpacing">
+    <w:name w:val="No Spacing"/>
+    <w:uiPriority w:val="1"/>
+    <w:qFormat/>
+    <w:rsid w:val="00861CBD"/>
+    <w:pPr>
+      <w:spacing w:after="0" w:line="240" w:lineRule="auto"/>
+    </w:pPr>
+  </w:style>
+  <w:style w:type="table" w:styleId="TableGrid">
+    <w:name w:val="Table Grid"/>
+    <w:basedOn w:val="TableNormal"/>
+    <w:uiPriority w:val="39"/>
+    <w:rsid w:val="001135D5"/>
+    <w:pPr>
+      <w:spacing w:after="0" w:line="240" w:lineRule="auto"/>
+    </w:pPr>
+    <w:tblPr>
+      <w:tblBorders>
+        <w:top w:val="single" w:sz="4" w:space="0" w:color="auto"/>
+        <w:left w:val="single" w:sz="4" w:space="0" w:color="auto"/>
+        <w:bottom w:val="single" w:sz="4" w:space="0" w:color="auto"/>
+        <w:right w:val="single" w:sz="4" w:space="0" w:color="auto"/>
+        <w:insideH w:val="single" w:sz="4" w:space="0" w:color="auto"/>
+        <w:insideV w:val="single" w:sz="4" w:space="0" w:color="auto"/>
+      </w:tblBorders>
+    </w:tblPr>
+  </w:style>
 </w:styles>
 </file>
 

</xml_diff>